<commit_message>
Updated documents and QF contents
</commit_message>
<xml_diff>
--- a/02_Core_Quant_Finance/8. Market Microstructure/Market Microstructure.docx
+++ b/02_Core_Quant_Finance/8. Market Microstructure/Market Microstructure.docx
@@ -84,6 +84,8 @@
         <w:spacing w:after="200"/>
         <w:jc w:val="center"/>
         <w:rPr>
+          <w:b/>
+          <w:bCs/>
           <w:color w:val="1F3864"/>
           <w:sz w:val="40"/>
           <w:szCs w:val="40"/>
@@ -91,6 +93,8 @@
       </w:pPr>
       <w:r>
         <w:rPr>
+          <w:b/>
+          <w:bCs/>
           <w:color w:val="1F3864"/>
           <w:sz w:val="40"/>
           <w:szCs w:val="40"/>
@@ -467,7 +471,32 @@
         <w:pStyle w:val="Heading1"/>
         <w:spacing w:before="320"/>
       </w:pPr>
-      <w:r>
+    </w:p>
+    <w:p>
+      <w:pPr>
+        <w:pStyle w:val="Heading1"/>
+        <w:spacing w:before="320"/>
+      </w:pPr>
+    </w:p>
+    <w:p>
+      <w:pPr>
+        <w:pStyle w:val="Heading1"/>
+        <w:spacing w:before="320"/>
+      </w:pPr>
+    </w:p>
+    <w:p>
+      <w:pPr>
+        <w:pStyle w:val="Heading1"/>
+        <w:spacing w:before="320"/>
+      </w:pPr>
+    </w:p>
+    <w:p>
+      <w:pPr>
+        <w:pStyle w:val="Heading1"/>
+        <w:spacing w:before="320"/>
+      </w:pPr>
+      <w:r>
+        <w:lastRenderedPageBreak/>
         <w:t>How to Use This Guide</w:t>
       </w:r>
     </w:p>
@@ -502,7 +531,6 @@
         <w:spacing w:after="160"/>
       </w:pPr>
       <w:r>
-        <w:lastRenderedPageBreak/>
         <w:t xml:space="preserve">The module is self-contained: every concept is introduced from first principles, paired with a worked numerical example, and illustrated with a chart or diagram wherever a picture makes the idea land faster than prose. Read it start to finish if microstructure is new to you, or jump straight to the section you need — but do not skip </w:t>
       </w:r>
       <w:r>
@@ -611,12 +639,6 @@
         <w:gridCol w:w="9360"/>
       </w:tblGrid>
       <w:tr>
-        <w:tblPrEx>
-          <w:tblCellMar>
-            <w:top w:w="0" w:type="dxa"/>
-            <w:bottom w:w="0" w:type="dxa"/>
-          </w:tblCellMar>
-        </w:tblPrEx>
         <w:tc>
           <w:tcPr>
             <w:tcW w:w="0" w:type="auto"/>
@@ -712,6 +734,7 @@
         <w:spacing w:before="320"/>
       </w:pPr>
       <w:r>
+        <w:lastRenderedPageBreak/>
         <w:t>How This Connects to the Rest of the Curriculum</w:t>
       </w:r>
     </w:p>
@@ -757,7 +780,6 @@
           <w:b/>
           <w:bCs/>
         </w:rPr>
-        <w:lastRenderedPageBreak/>
         <w:t>Development —</w:t>
       </w:r>
       <w:r>
@@ -1012,6 +1034,7 @@
           <w:b/>
           <w:bCs/>
         </w:rPr>
+        <w:lastRenderedPageBreak/>
         <w:t>Slippage —</w:t>
       </w:r>
       <w:r>
@@ -1042,7 +1065,6 @@
           <w:b/>
           <w:bCs/>
         </w:rPr>
-        <w:lastRenderedPageBreak/>
         <w:t>Latency —</w:t>
       </w:r>
       <w:r>
@@ -1187,6 +1209,9 @@
         <w:spacing w:after="160"/>
       </w:pPr>
       <w:r>
+        <w:rPr>
+          <w:noProof/>
+        </w:rPr>
         <w:drawing>
           <wp:inline distT="0" distB="0" distL="0" distR="0" wp14:anchorId="214875AA" wp14:editId="2469E842">
             <wp:extent cx="5943600" cy="3510915"/>
@@ -1269,12 +1294,6 @@
         <w:gridCol w:w="9360"/>
       </w:tblGrid>
       <w:tr>
-        <w:tblPrEx>
-          <w:tblCellMar>
-            <w:top w:w="0" w:type="dxa"/>
-            <w:bottom w:w="0" w:type="dxa"/>
-          </w:tblCellMar>
-        </w:tblPrEx>
         <w:tc>
           <w:tcPr>
             <w:tcW w:w="0" w:type="auto"/>
@@ -1512,12 +1531,6 @@
         <w:gridCol w:w="9350"/>
       </w:tblGrid>
       <w:tr>
-        <w:tblPrEx>
-          <w:tblCellMar>
-            <w:top w:w="0" w:type="dxa"/>
-            <w:bottom w:w="0" w:type="dxa"/>
-          </w:tblCellMar>
-        </w:tblPrEx>
         <w:tc>
           <w:tcPr>
             <w:tcW w:w="0" w:type="auto"/>
@@ -1749,10 +1762,6 @@
             <w:bottom w:val="single" w:sz="6" w:space="0" w:color="999999"/>
             <w:right w:val="none" w:sz="0" w:space="0" w:color="auto"/>
           </w:tblBorders>
-          <w:tblCellMar>
-            <w:top w:w="0" w:type="dxa"/>
-            <w:bottom w:w="0" w:type="dxa"/>
-          </w:tblCellMar>
         </w:tblPrEx>
         <w:tc>
           <w:tcPr>
@@ -1830,6 +1839,9 @@
         <w:jc w:val="center"/>
       </w:pPr>
       <w:r>
+        <w:rPr>
+          <w:noProof/>
+        </w:rPr>
         <w:drawing>
           <wp:inline distT="0" distB="0" distL="0" distR="0" wp14:anchorId="2895C633" wp14:editId="2435192D">
             <wp:extent cx="5337110" cy="1780747"/>
@@ -2024,12 +2036,6 @@
         <w:gridCol w:w="9360"/>
       </w:tblGrid>
       <w:tr>
-        <w:tblPrEx>
-          <w:tblCellMar>
-            <w:top w:w="0" w:type="dxa"/>
-            <w:bottom w:w="0" w:type="dxa"/>
-          </w:tblCellMar>
-        </w:tblPrEx>
         <w:tc>
           <w:tcPr>
             <w:tcW w:w="0" w:type="auto"/>
@@ -2099,6 +2105,9 @@
         <w:jc w:val="center"/>
       </w:pPr>
       <w:r>
+        <w:rPr>
+          <w:noProof/>
+        </w:rPr>
         <w:drawing>
           <wp:inline distT="0" distB="0" distL="0" distR="0" wp14:anchorId="08081F92" wp14:editId="08E00876">
             <wp:extent cx="5943600" cy="2889250"/>
@@ -2323,12 +2332,6 @@
         <w:gridCol w:w="9360"/>
       </w:tblGrid>
       <w:tr>
-        <w:tblPrEx>
-          <w:tblCellMar>
-            <w:top w:w="0" w:type="dxa"/>
-            <w:bottom w:w="0" w:type="dxa"/>
-          </w:tblCellMar>
-        </w:tblPrEx>
         <w:tc>
           <w:tcPr>
             <w:tcW w:w="0" w:type="auto"/>
@@ -3111,12 +3114,6 @@
         <w:gridCol w:w="9350"/>
       </w:tblGrid>
       <w:tr>
-        <w:tblPrEx>
-          <w:tblCellMar>
-            <w:top w:w="0" w:type="dxa"/>
-            <w:bottom w:w="0" w:type="dxa"/>
-          </w:tblCellMar>
-        </w:tblPrEx>
         <w:tc>
           <w:tcPr>
             <w:tcW w:w="0" w:type="auto"/>
@@ -3436,10 +3433,6 @@
             <w:bottom w:val="single" w:sz="6" w:space="0" w:color="999999"/>
             <w:right w:val="none" w:sz="0" w:space="0" w:color="auto"/>
           </w:tblBorders>
-          <w:tblCellMar>
-            <w:top w:w="0" w:type="dxa"/>
-            <w:bottom w:w="0" w:type="dxa"/>
-          </w:tblCellMar>
         </w:tblPrEx>
         <w:tc>
           <w:tcPr>
@@ -3460,6 +3453,7 @@
                 <w:i/>
                 <w:iCs/>
               </w:rPr>
+              <w:lastRenderedPageBreak/>
               <w:t xml:space="preserve">Common mistake — </w:t>
             </w:r>
             <w:proofErr w:type="spellStart"/>
@@ -3612,12 +3606,6 @@
         <w:gridCol w:w="9360"/>
       </w:tblGrid>
       <w:tr>
-        <w:tblPrEx>
-          <w:tblCellMar>
-            <w:top w:w="0" w:type="dxa"/>
-            <w:bottom w:w="0" w:type="dxa"/>
-          </w:tblCellMar>
-        </w:tblPrEx>
         <w:tc>
           <w:tcPr>
             <w:tcW w:w="0" w:type="auto"/>
@@ -3814,12 +3802,6 @@
         <w:gridCol w:w="9360"/>
       </w:tblGrid>
       <w:tr>
-        <w:tblPrEx>
-          <w:tblCellMar>
-            <w:top w:w="0" w:type="dxa"/>
-            <w:bottom w:w="0" w:type="dxa"/>
-          </w:tblCellMar>
-        </w:tblPrEx>
         <w:tc>
           <w:tcPr>
             <w:tcW w:w="0" w:type="auto"/>
@@ -3990,12 +3972,6 @@
         <w:gridCol w:w="9350"/>
       </w:tblGrid>
       <w:tr>
-        <w:tblPrEx>
-          <w:tblCellMar>
-            <w:top w:w="0" w:type="dxa"/>
-            <w:bottom w:w="0" w:type="dxa"/>
-          </w:tblCellMar>
-        </w:tblPrEx>
         <w:tc>
           <w:tcPr>
             <w:tcW w:w="0" w:type="auto"/>

</xml_diff>